<commit_message>
Added quality assurance metrics to the test plan
</commit_message>
<xml_diff>
--- a/documentation/Test plan.docx
+++ b/documentation/Test plan.docx
@@ -52,11 +52,23 @@
     </w:p>
     <w:p>
       <w:pPr>
-        <w:rPr>
-          <w:b/>
-          <w:bCs/>
-        </w:rPr>
-      </w:pPr>
+        <w:jc w:val="center"/>
+        <w:rPr>
+          <w:b/>
+          <w:bCs/>
+          <w:sz w:val="40"/>
+          <w:szCs w:val="40"/>
+        </w:rPr>
+      </w:pPr>
+      <w:r>
+        <w:rPr>
+          <w:b/>
+          <w:bCs/>
+          <w:sz w:val="40"/>
+          <w:szCs w:val="40"/>
+        </w:rPr>
+        <w:t>Test Plan</w:t>
+      </w:r>
     </w:p>
     <w:p>
       <w:pPr>
@@ -245,6 +257,7 @@
         </w:numPr>
       </w:pPr>
       <w:r>
+        <w:lastRenderedPageBreak/>
         <w:t>Error handling for</w:t>
       </w:r>
       <w:r>
@@ -260,7 +273,6 @@
         </w:numPr>
       </w:pPr>
       <w:r>
-        <w:lastRenderedPageBreak/>
         <w:t>No results</w:t>
       </w:r>
     </w:p>
@@ -507,6 +519,7 @@
         </w:numPr>
       </w:pPr>
       <w:r>
+        <w:lastRenderedPageBreak/>
         <w:t>Unit tests</w:t>
       </w:r>
     </w:p>
@@ -519,7 +532,6 @@
         </w:numPr>
       </w:pPr>
       <w:r>
-        <w:lastRenderedPageBreak/>
         <w:t>Validation</w:t>
       </w:r>
     </w:p>
@@ -797,6 +809,7 @@
         </w:numPr>
       </w:pPr>
       <w:r>
+        <w:lastRenderedPageBreak/>
         <w:t>Discount programs matching specific stations</w:t>
       </w:r>
     </w:p>
@@ -809,30 +822,377 @@
         </w:numPr>
       </w:pPr>
       <w:r>
+        <w:t>Cache</w:t>
+      </w:r>
+      <w:r>
+        <w:t>d</w:t>
+      </w:r>
+      <w:r>
+        <w:t xml:space="preserve"> snapshot with timestamps</w:t>
+      </w:r>
+    </w:p>
+    <w:p/>
+    <w:p>
+      <w:pPr>
+        <w:rPr>
+          <w:b/>
+          <w:bCs/>
+        </w:rPr>
+      </w:pPr>
+      <w:r>
+        <w:rPr>
+          <w:b/>
+          <w:bCs/>
+        </w:rPr>
+        <w:t>Test Environment</w:t>
+      </w:r>
+      <w:r>
+        <w:rPr>
+          <w:b/>
+          <w:bCs/>
+        </w:rPr>
+        <w:t>:</w:t>
+      </w:r>
+    </w:p>
+    <w:p>
+      <w:pPr>
+        <w:ind w:firstLine="720"/>
+      </w:pPr>
+      <w:r>
+        <w:t>The testing environments will be finalized by the end of sprint 2. It will most likely include multiple browser types, device types, online and offline modes</w:t>
+      </w:r>
+      <w:r>
+        <w:t>,</w:t>
+      </w:r>
+      <w:r>
+        <w:t xml:space="preserve"> and location services allowed and blocked.</w:t>
+      </w:r>
+    </w:p>
+    <w:p/>
+    <w:p>
+      <w:pPr>
+        <w:rPr>
+          <w:b/>
+          <w:bCs/>
+        </w:rPr>
+      </w:pPr>
+      <w:r>
+        <w:rPr>
+          <w:b/>
+          <w:bCs/>
+        </w:rPr>
+        <w:t>Test Cases</w:t>
+      </w:r>
+      <w:r>
+        <w:rPr>
+          <w:b/>
+          <w:bCs/>
+        </w:rPr>
+        <w:t>:</w:t>
+      </w:r>
+    </w:p>
+    <w:p>
+      <w:pPr>
+        <w:ind w:firstLine="720"/>
+      </w:pPr>
+      <w:r>
+        <w:t>Test cases will be finalized by the end of sprint 2. They will cover the expected scop</w:t>
+      </w:r>
+      <w:r>
+        <w:t>e</w:t>
+      </w:r>
+      <w:r>
+        <w:t xml:space="preserve"> of the testing plan with pass/fail information included.</w:t>
+      </w:r>
+    </w:p>
+    <w:p/>
+    <w:p>
+      <w:pPr>
+        <w:rPr>
+          <w:b/>
+          <w:bCs/>
+        </w:rPr>
+      </w:pPr>
+      <w:r>
+        <w:rPr>
+          <w:b/>
+          <w:bCs/>
+        </w:rPr>
+        <w:t>Pass/Fail Criteria</w:t>
+      </w:r>
+      <w:r>
+        <w:rPr>
+          <w:b/>
+          <w:bCs/>
+        </w:rPr>
+        <w:t>:</w:t>
+      </w:r>
+    </w:p>
+    <w:p>
+      <w:pPr>
+        <w:spacing w:line="360" w:lineRule="auto"/>
+      </w:pPr>
+      <w:r>
+        <w:t>Functional: 100</w:t>
+      </w:r>
+      <w:r>
+        <w:t>%</w:t>
+      </w:r>
+      <w:r>
+        <w:t xml:space="preserve"> of functional test cases must pass</w:t>
+      </w:r>
+    </w:p>
+    <w:p>
+      <w:pPr>
+        <w:spacing w:line="360" w:lineRule="auto"/>
+      </w:pPr>
+      <w:r>
+        <w:t>Non-functional: Must meet defined thresholds</w:t>
+      </w:r>
+    </w:p>
+    <w:p>
+      <w:pPr>
+        <w:spacing w:line="360" w:lineRule="auto"/>
+      </w:pPr>
+      <w:r>
+        <w:t>Any crash on common user flow is a fail</w:t>
+      </w:r>
+    </w:p>
+    <w:p>
+      <w:pPr>
+        <w:spacing w:line="360" w:lineRule="auto"/>
+      </w:pPr>
+    </w:p>
+    <w:p>
+      <w:pPr>
+        <w:spacing w:line="360" w:lineRule="auto"/>
+      </w:pPr>
+    </w:p>
+    <w:p>
+      <w:pPr>
+        <w:spacing w:line="360" w:lineRule="auto"/>
+      </w:pPr>
+    </w:p>
+    <w:p>
+      <w:pPr>
+        <w:spacing w:line="360" w:lineRule="auto"/>
+      </w:pPr>
+    </w:p>
+    <w:p>
+      <w:pPr>
+        <w:spacing w:line="360" w:lineRule="auto"/>
+      </w:pPr>
+    </w:p>
+    <w:p>
+      <w:pPr>
+        <w:rPr>
+          <w:b/>
+          <w:bCs/>
+        </w:rPr>
+      </w:pPr>
+      <w:r>
+        <w:rPr>
+          <w:b/>
+          <w:bCs/>
+        </w:rPr>
         <w:lastRenderedPageBreak/>
-        <w:t>Cache</w:t>
-      </w:r>
-      <w:r>
-        <w:t>d</w:t>
-      </w:r>
-      <w:r>
-        <w:t xml:space="preserve"> snapshot with timestamps</w:t>
+        <w:t>Schedule</w:t>
+      </w:r>
+      <w:r>
+        <w:rPr>
+          <w:b/>
+          <w:bCs/>
+        </w:rPr>
+        <w:t>:</w:t>
+      </w:r>
+    </w:p>
+    <w:p>
+      <w:pPr>
+        <w:ind w:firstLine="720"/>
+      </w:pPr>
+      <w:r>
+        <w:t xml:space="preserve">This testing plan </w:t>
+      </w:r>
+      <w:r>
+        <w:t>will be finalized by the end of sprint 2. The unit testing and integration testing will be performed in sprint 3. System testing and non-functional testing will be carried out in sprint 4.</w:t>
+      </w:r>
+    </w:p>
+    <w:p>
+      <w:pPr>
+        <w:ind w:firstLine="720"/>
+      </w:pPr>
+    </w:p>
+    <w:p>
+      <w:pPr>
+        <w:ind w:firstLine="720"/>
+      </w:pPr>
+    </w:p>
+    <w:p>
+      <w:pPr>
+        <w:ind w:firstLine="720"/>
+      </w:pPr>
+    </w:p>
+    <w:p>
+      <w:pPr>
+        <w:ind w:firstLine="720"/>
+      </w:pPr>
+    </w:p>
+    <w:p>
+      <w:pPr>
+        <w:ind w:firstLine="720"/>
+      </w:pPr>
+    </w:p>
+    <w:p>
+      <w:pPr>
+        <w:ind w:firstLine="720"/>
+      </w:pPr>
+    </w:p>
+    <w:p>
+      <w:pPr>
+        <w:ind w:firstLine="720"/>
+      </w:pPr>
+    </w:p>
+    <w:p>
+      <w:pPr>
+        <w:ind w:firstLine="720"/>
+      </w:pPr>
+    </w:p>
+    <w:p>
+      <w:pPr>
+        <w:ind w:firstLine="720"/>
+      </w:pPr>
+    </w:p>
+    <w:p>
+      <w:pPr>
+        <w:ind w:firstLine="720"/>
+      </w:pPr>
+    </w:p>
+    <w:p>
+      <w:pPr>
+        <w:ind w:firstLine="720"/>
+      </w:pPr>
+    </w:p>
+    <w:p>
+      <w:pPr>
+        <w:ind w:firstLine="720"/>
+      </w:pPr>
+    </w:p>
+    <w:p>
+      <w:pPr>
+        <w:ind w:firstLine="720"/>
+      </w:pPr>
+    </w:p>
+    <w:p>
+      <w:pPr>
+        <w:ind w:firstLine="720"/>
+      </w:pPr>
+    </w:p>
+    <w:p>
+      <w:pPr>
+        <w:ind w:firstLine="720"/>
+      </w:pPr>
+    </w:p>
+    <w:p>
+      <w:pPr>
+        <w:ind w:firstLine="720"/>
+      </w:pPr>
+    </w:p>
+    <w:p>
+      <w:pPr>
+        <w:ind w:firstLine="720"/>
+        <w:jc w:val="center"/>
+        <w:rPr>
+          <w:b/>
+          <w:bCs/>
+          <w:sz w:val="40"/>
+          <w:szCs w:val="40"/>
+        </w:rPr>
+      </w:pPr>
+      <w:r>
+        <w:rPr>
+          <w:b/>
+          <w:bCs/>
+          <w:sz w:val="40"/>
+          <w:szCs w:val="40"/>
+        </w:rPr>
+        <w:t>Quality Assurance Metrics</w:t>
+      </w:r>
+    </w:p>
+    <w:p>
+      <w:pPr>
+        <w:ind w:firstLine="720"/>
+      </w:pPr>
+    </w:p>
+    <w:p>
+      <w:r>
+        <w:rPr>
+          <w:b/>
+          <w:bCs/>
+        </w:rPr>
+        <w:t>Design metric</w:t>
+      </w:r>
+      <w:r>
+        <w:rPr>
+          <w:b/>
+          <w:bCs/>
+        </w:rPr>
+        <w:t>:</w:t>
+      </w:r>
+    </w:p>
+    <w:p>
+      <w:pPr>
+        <w:ind w:firstLine="720"/>
+      </w:pPr>
+      <w:r>
+        <w:t>The design metric chosen for Find a Pump is high cohesion. This will be achieved by clearly dividing responsibilities and ensuring that each module has a single, well-defined purpose. High cohesion improves maintainability, makes the system easier to understand, and helps isolate defects, which in turn facilitates faster debugging and more reliable enhancements.</w:t>
+      </w:r>
+    </w:p>
+    <w:p>
+      <w:pPr>
+        <w:rPr>
+          <w:b/>
+          <w:bCs/>
+        </w:rPr>
+      </w:pPr>
+    </w:p>
+    <w:p>
+      <w:r>
+        <w:rPr>
+          <w:b/>
+          <w:bCs/>
+        </w:rPr>
+        <w:t>Testing metric</w:t>
+      </w:r>
+      <w:r>
+        <w:rPr>
+          <w:b/>
+          <w:bCs/>
+        </w:rPr>
+        <w:t>:</w:t>
+      </w:r>
+    </w:p>
+    <w:p>
+      <w:r>
+        <w:tab/>
+      </w:r>
+      <w:r>
+        <w:t>The chosen testing metric for Find a Pump is test pass rate. The project will track the percentage of automated and manual tests that pass during each test cycle. The goal is to maintain a</w:t>
+      </w:r>
+      <w:r>
+        <w:t xml:space="preserve"> </w:t>
+      </w:r>
+      <w:r>
+        <w:t>100% pass rate before release to ensure that core functionality remains stable and that regressions are caught early.</w:t>
       </w:r>
     </w:p>
     <w:p/>
     <w:p>
-      <w:pPr>
-        <w:rPr>
-          <w:b/>
-          <w:bCs/>
-        </w:rPr>
-      </w:pPr>
-      <w:r>
-        <w:rPr>
-          <w:b/>
-          <w:bCs/>
-        </w:rPr>
-        <w:t>Test Environment</w:t>
+      <w:r>
+        <w:rPr>
+          <w:b/>
+          <w:bCs/>
+        </w:rPr>
+        <w:t>QA metric</w:t>
       </w:r>
       <w:r>
         <w:rPr>
@@ -843,33 +1203,55 @@
       </w:r>
     </w:p>
     <w:p>
+      <w:r>
+        <w:tab/>
+      </w:r>
+      <w:r>
+        <w:t>Find a Pump is committed to maintaining a high defect removal efficiency (DRE) in order to catch as many defects as possible before release. This metric measures the proportion of defects found before deployment compared to those found after release. A high DRE reduces the number of escaped defects and helps ensure a higher quality product for end users.</w:t>
+      </w:r>
+    </w:p>
+    <w:p>
       <w:pPr>
         <w:ind w:firstLine="720"/>
       </w:pPr>
-      <w:r>
-        <w:t>The testing environments will be finalized by the end of sprint 2. It will most likely include multiple browser types, device types, online and offline modes</w:t>
-      </w:r>
-      <w:r>
-        <w:t>,</w:t>
-      </w:r>
-      <w:r>
-        <w:t xml:space="preserve"> and location services allowed and blocked.</w:t>
+    </w:p>
+    <w:p>
+      <w:pPr>
+        <w:ind w:firstLine="720"/>
+      </w:pPr>
+    </w:p>
+    <w:p>
+      <w:r>
+        <w:rPr>
+          <w:b/>
+          <w:bCs/>
+        </w:rPr>
+        <w:t>Process metric</w:t>
+      </w:r>
+      <w:r>
+        <w:rPr>
+          <w:b/>
+          <w:bCs/>
+        </w:rPr>
+        <w:t>:</w:t>
+      </w:r>
+    </w:p>
+    <w:p>
+      <w:r>
+        <w:tab/>
+      </w:r>
+      <w:r>
+        <w:t>To ensure that Find a Pump is released in a timely manner, sprint velocity will be monitored and evaluated. Tracking sprint velocity allows the team to measure how much work is completed per sprint, improve planning accuracy, and identify potential slowdowns, while still maintaining a strong focus on quality.</w:t>
       </w:r>
     </w:p>
     <w:p/>
     <w:p>
-      <w:pPr>
-        <w:rPr>
-          <w:b/>
-          <w:bCs/>
-        </w:rPr>
-      </w:pPr>
-      <w:r>
-        <w:rPr>
-          <w:b/>
-          <w:bCs/>
-        </w:rPr>
-        <w:t>Test Cases</w:t>
+      <w:r>
+        <w:rPr>
+          <w:b/>
+          <w:bCs/>
+        </w:rPr>
+        <w:t>Maintenance metric</w:t>
       </w:r>
       <w:r>
         <w:rPr>
@@ -880,108 +1262,11 @@
       </w:r>
     </w:p>
     <w:p>
-      <w:pPr>
-        <w:ind w:firstLine="720"/>
-      </w:pPr>
-      <w:r>
-        <w:t>Test cases will be finalized by the end of sprint 2. They will cover the expected scop</w:t>
-      </w:r>
-      <w:r>
-        <w:t>e</w:t>
-      </w:r>
-      <w:r>
-        <w:t xml:space="preserve"> of the testing plan with pass/fail information included.</w:t>
-      </w:r>
-    </w:p>
-    <w:p/>
-    <w:p>
-      <w:pPr>
-        <w:rPr>
-          <w:b/>
-          <w:bCs/>
-        </w:rPr>
-      </w:pPr>
-      <w:r>
-        <w:rPr>
-          <w:b/>
-          <w:bCs/>
-        </w:rPr>
-        <w:t>Pass/Fail Criteria</w:t>
-      </w:r>
-      <w:r>
-        <w:rPr>
-          <w:b/>
-          <w:bCs/>
-        </w:rPr>
-        <w:t>:</w:t>
-      </w:r>
-    </w:p>
-    <w:p>
-      <w:pPr>
-        <w:spacing w:line="360" w:lineRule="auto"/>
-      </w:pPr>
-      <w:r>
-        <w:t>Functional: 100</w:t>
-      </w:r>
-      <w:r>
-        <w:t>%</w:t>
-      </w:r>
-      <w:r>
-        <w:t xml:space="preserve"> of functional test cases must pass</w:t>
-      </w:r>
-    </w:p>
-    <w:p>
-      <w:pPr>
-        <w:spacing w:line="360" w:lineRule="auto"/>
-      </w:pPr>
-      <w:r>
-        <w:t>Non-functional: Must meet defined thresholds</w:t>
-      </w:r>
-    </w:p>
-    <w:p>
-      <w:pPr>
-        <w:spacing w:line="360" w:lineRule="auto"/>
-      </w:pPr>
-      <w:r>
-        <w:t>Any crash on common user flow is a fail</w:t>
-      </w:r>
-    </w:p>
-    <w:p>
-      <w:pPr>
-        <w:spacing w:line="360" w:lineRule="auto"/>
-      </w:pPr>
-    </w:p>
-    <w:p>
-      <w:pPr>
-        <w:rPr>
-          <w:b/>
-          <w:bCs/>
-        </w:rPr>
-      </w:pPr>
-      <w:r>
-        <w:rPr>
-          <w:b/>
-          <w:bCs/>
-        </w:rPr>
-        <w:t>Schedule</w:t>
-      </w:r>
-      <w:r>
-        <w:rPr>
-          <w:b/>
-          <w:bCs/>
-        </w:rPr>
-        <w:t>:</w:t>
-      </w:r>
-    </w:p>
-    <w:p>
-      <w:pPr>
-        <w:ind w:firstLine="720"/>
-      </w:pPr>
-      <w:r>
-        <w:t xml:space="preserve">This testing plan </w:t>
-      </w:r>
-      <w:r>
-        <w:t>will be finalized by the end of sprint 2. The unit testing and integration testing will be performed in sprint 3. System testing and non-functional testing will be carried out in sprint 4.</w:t>
+      <w:r>
+        <w:tab/>
+      </w:r>
+      <w:r>
+        <w:t>For maintenance, Find a Pump will monitor the size of its maintenance backlog and aim to keep it as small as possible. This will be achieved by consistently prioritizing and addressing bugs, technical debt, and post-release issues, helping ensure long-term stability and maintainability of the system.</w:t>
       </w:r>
     </w:p>
     <w:sectPr>
@@ -1421,6 +1706,155 @@
     </w:lvl>
   </w:abstractNum>
   <w:abstractNum w:abstractNumId="4" w15:restartNumberingAfterBreak="0">
+    <w:nsid w:val="55804A6B"/>
+    <w:multiLevelType w:val="multilevel"/>
+    <w:tmpl w:val="53348506"/>
+    <w:lvl w:ilvl="0">
+      <w:start w:val="1"/>
+      <w:numFmt w:val="bullet"/>
+      <w:lvlText w:val=""/>
+      <w:lvlJc w:val="left"/>
+      <w:pPr>
+        <w:tabs>
+          <w:tab w:val="num" w:pos="720"/>
+        </w:tabs>
+        <w:ind w:left="720" w:hanging="360"/>
+      </w:pPr>
+      <w:rPr>
+        <w:rFonts w:ascii="Symbol" w:hAnsi="Symbol" w:hint="default"/>
+        <w:sz w:val="20"/>
+      </w:rPr>
+    </w:lvl>
+    <w:lvl w:ilvl="1" w:tentative="1">
+      <w:start w:val="1"/>
+      <w:numFmt w:val="bullet"/>
+      <w:lvlText w:val="o"/>
+      <w:lvlJc w:val="left"/>
+      <w:pPr>
+        <w:tabs>
+          <w:tab w:val="num" w:pos="1440"/>
+        </w:tabs>
+        <w:ind w:left="1440" w:hanging="360"/>
+      </w:pPr>
+      <w:rPr>
+        <w:rFonts w:ascii="Courier New" w:hAnsi="Courier New" w:hint="default"/>
+        <w:sz w:val="20"/>
+      </w:rPr>
+    </w:lvl>
+    <w:lvl w:ilvl="2" w:tentative="1">
+      <w:start w:val="1"/>
+      <w:numFmt w:val="bullet"/>
+      <w:lvlText w:val=""/>
+      <w:lvlJc w:val="left"/>
+      <w:pPr>
+        <w:tabs>
+          <w:tab w:val="num" w:pos="2160"/>
+        </w:tabs>
+        <w:ind w:left="2160" w:hanging="360"/>
+      </w:pPr>
+      <w:rPr>
+        <w:rFonts w:ascii="Wingdings" w:hAnsi="Wingdings" w:hint="default"/>
+        <w:sz w:val="20"/>
+      </w:rPr>
+    </w:lvl>
+    <w:lvl w:ilvl="3" w:tentative="1">
+      <w:start w:val="1"/>
+      <w:numFmt w:val="bullet"/>
+      <w:lvlText w:val=""/>
+      <w:lvlJc w:val="left"/>
+      <w:pPr>
+        <w:tabs>
+          <w:tab w:val="num" w:pos="2880"/>
+        </w:tabs>
+        <w:ind w:left="2880" w:hanging="360"/>
+      </w:pPr>
+      <w:rPr>
+        <w:rFonts w:ascii="Wingdings" w:hAnsi="Wingdings" w:hint="default"/>
+        <w:sz w:val="20"/>
+      </w:rPr>
+    </w:lvl>
+    <w:lvl w:ilvl="4" w:tentative="1">
+      <w:start w:val="1"/>
+      <w:numFmt w:val="bullet"/>
+      <w:lvlText w:val=""/>
+      <w:lvlJc w:val="left"/>
+      <w:pPr>
+        <w:tabs>
+          <w:tab w:val="num" w:pos="3600"/>
+        </w:tabs>
+        <w:ind w:left="3600" w:hanging="360"/>
+      </w:pPr>
+      <w:rPr>
+        <w:rFonts w:ascii="Wingdings" w:hAnsi="Wingdings" w:hint="default"/>
+        <w:sz w:val="20"/>
+      </w:rPr>
+    </w:lvl>
+    <w:lvl w:ilvl="5" w:tentative="1">
+      <w:start w:val="1"/>
+      <w:numFmt w:val="bullet"/>
+      <w:lvlText w:val=""/>
+      <w:lvlJc w:val="left"/>
+      <w:pPr>
+        <w:tabs>
+          <w:tab w:val="num" w:pos="4320"/>
+        </w:tabs>
+        <w:ind w:left="4320" w:hanging="360"/>
+      </w:pPr>
+      <w:rPr>
+        <w:rFonts w:ascii="Wingdings" w:hAnsi="Wingdings" w:hint="default"/>
+        <w:sz w:val="20"/>
+      </w:rPr>
+    </w:lvl>
+    <w:lvl w:ilvl="6" w:tentative="1">
+      <w:start w:val="1"/>
+      <w:numFmt w:val="bullet"/>
+      <w:lvlText w:val=""/>
+      <w:lvlJc w:val="left"/>
+      <w:pPr>
+        <w:tabs>
+          <w:tab w:val="num" w:pos="5040"/>
+        </w:tabs>
+        <w:ind w:left="5040" w:hanging="360"/>
+      </w:pPr>
+      <w:rPr>
+        <w:rFonts w:ascii="Wingdings" w:hAnsi="Wingdings" w:hint="default"/>
+        <w:sz w:val="20"/>
+      </w:rPr>
+    </w:lvl>
+    <w:lvl w:ilvl="7" w:tentative="1">
+      <w:start w:val="1"/>
+      <w:numFmt w:val="bullet"/>
+      <w:lvlText w:val=""/>
+      <w:lvlJc w:val="left"/>
+      <w:pPr>
+        <w:tabs>
+          <w:tab w:val="num" w:pos="5760"/>
+        </w:tabs>
+        <w:ind w:left="5760" w:hanging="360"/>
+      </w:pPr>
+      <w:rPr>
+        <w:rFonts w:ascii="Wingdings" w:hAnsi="Wingdings" w:hint="default"/>
+        <w:sz w:val="20"/>
+      </w:rPr>
+    </w:lvl>
+    <w:lvl w:ilvl="8" w:tentative="1">
+      <w:start w:val="1"/>
+      <w:numFmt w:val="bullet"/>
+      <w:lvlText w:val=""/>
+      <w:lvlJc w:val="left"/>
+      <w:pPr>
+        <w:tabs>
+          <w:tab w:val="num" w:pos="6480"/>
+        </w:tabs>
+        <w:ind w:left="6480" w:hanging="360"/>
+      </w:pPr>
+      <w:rPr>
+        <w:rFonts w:ascii="Wingdings" w:hAnsi="Wingdings" w:hint="default"/>
+        <w:sz w:val="20"/>
+      </w:rPr>
+    </w:lvl>
+  </w:abstractNum>
+  <w:abstractNum w:abstractNumId="5" w15:restartNumberingAfterBreak="0">
     <w:nsid w:val="5D8A523D"/>
     <w:multiLevelType w:val="hybridMultilevel"/>
     <w:tmpl w:val="53A2F28E"/>
@@ -1533,7 +1967,7 @@
       </w:rPr>
     </w:lvl>
   </w:abstractNum>
-  <w:abstractNum w:abstractNumId="5" w15:restartNumberingAfterBreak="0">
+  <w:abstractNum w:abstractNumId="6" w15:restartNumberingAfterBreak="0">
     <w:nsid w:val="6463687F"/>
     <w:multiLevelType w:val="hybridMultilevel"/>
     <w:tmpl w:val="3CA8534E"/>
@@ -1619,7 +2053,7 @@
       </w:pPr>
     </w:lvl>
   </w:abstractNum>
-  <w:abstractNum w:abstractNumId="6" w15:restartNumberingAfterBreak="0">
+  <w:abstractNum w:abstractNumId="7" w15:restartNumberingAfterBreak="0">
     <w:nsid w:val="74B05759"/>
     <w:multiLevelType w:val="hybridMultilevel"/>
     <w:tmpl w:val="8424FB7E"/>
@@ -1705,7 +2139,7 @@
       </w:pPr>
     </w:lvl>
   </w:abstractNum>
-  <w:abstractNum w:abstractNumId="7" w15:restartNumberingAfterBreak="0">
+  <w:abstractNum w:abstractNumId="8" w15:restartNumberingAfterBreak="0">
     <w:nsid w:val="74E07730"/>
     <w:multiLevelType w:val="hybridMultilevel"/>
     <w:tmpl w:val="DFB26612"/>
@@ -1791,7 +2225,7 @@
       </w:pPr>
     </w:lvl>
   </w:abstractNum>
-  <w:abstractNum w:abstractNumId="8" w15:restartNumberingAfterBreak="0">
+  <w:abstractNum w:abstractNumId="9" w15:restartNumberingAfterBreak="0">
     <w:nsid w:val="7729377F"/>
     <w:multiLevelType w:val="hybridMultilevel"/>
     <w:tmpl w:val="05668A04"/>
@@ -1881,7 +2315,7 @@
     </w:lvl>
   </w:abstractNum>
   <w:num w:numId="1" w16cid:durableId="666175233">
-    <w:abstractNumId w:val="5"/>
+    <w:abstractNumId w:val="6"/>
   </w:num>
   <w:num w:numId="2" w16cid:durableId="1873884495">
     <w:abstractNumId w:val="2"/>
@@ -1890,7 +2324,7 @@
     <w:abstractNumId w:val="0"/>
   </w:num>
   <w:num w:numId="4" w16cid:durableId="335545726">
-    <w:abstractNumId w:val="6"/>
+    <w:abstractNumId w:val="7"/>
   </w:num>
   <w:num w:numId="5" w16cid:durableId="1027486006">
     <w:abstractNumId w:val="1"/>
@@ -1899,13 +2333,16 @@
     <w:abstractNumId w:val="3"/>
   </w:num>
   <w:num w:numId="7" w16cid:durableId="1648319499">
-    <w:abstractNumId w:val="4"/>
+    <w:abstractNumId w:val="5"/>
   </w:num>
   <w:num w:numId="8" w16cid:durableId="691225503">
-    <w:abstractNumId w:val="7"/>
+    <w:abstractNumId w:val="8"/>
   </w:num>
   <w:num w:numId="9" w16cid:durableId="1055009317">
-    <w:abstractNumId w:val="8"/>
+    <w:abstractNumId w:val="9"/>
+  </w:num>
+  <w:num w:numId="10" w16cid:durableId="1739664911">
+    <w:abstractNumId w:val="4"/>
   </w:num>
 </w:numbering>
 </file>
@@ -2513,7 +2950,6 @@
   <w:style w:type="character" w:default="1" w:styleId="DefaultParagraphFont">
     <w:name w:val="Default Paragraph Font"/>
     <w:uiPriority w:val="1"/>
-    <w:semiHidden/>
     <w:unhideWhenUsed/>
   </w:style>
   <w:style w:type="table" w:default="1" w:styleId="TableNormal">

</xml_diff>